<commit_message>
Actualizar 0.PANEL_MONOGRAFICOS.csv, incluir ejemplos NLM y Educanietos, eliminar duplicados y actualizar ficha de Ciencias
</commit_message>
<xml_diff>
--- a/CLASES/5. EL_ABUELO_TUTOR_MATEMATICAS_HISTORIA/FICHA_MONOGRAFICO_EDUCANIETOS_IA.docx
+++ b/CLASES/5. EL_ABUELO_TUTOR_MATEMATICAS_HISTORIA/FICHA_MONOGRAFICO_EDUCANIETOS_IA.docx
@@ -44,7 +44,347 @@
           <w:color w:val="64748B"/>
           <w:sz w:val="23"/>
         </w:rPr>
-        <w:t>Tutor de Matemáticas Razonadas con IA y Sesiones en Pantalla de Historia y Ciencias con NotebookLM</w:t>
+        <w:t>Tutor de Ciencias, Física, Química y Matemáticas (Gemini) y Sesiones en Pantalla de Historia (NotebookLM)</w:t>
+      </w:r>
+    </w:p>
+    <w:tbl>
+      <w:tblPr>
+        <w:tblW w:type="auto" w:w="0"/>
+        <w:jc w:val="center"/>
+        <w:tblLayout w:type="fixed"/>
+        <w:tblLook w:firstColumn="1" w:firstRow="1" w:lastColumn="0" w:lastRow="0" w:noHBand="0" w:noVBand="1" w:val="04A0"/>
+      </w:tblPr>
+      <w:tblGrid>
+        <w:gridCol w:w="9360"/>
+      </w:tblGrid>
+      <w:tr>
+        <w:tc>
+          <w:tcPr>
+            <w:tcW w:type="dxa" w:w="9792"/>
+            <w:shd w:fill="F5F3FF"/>
+            <w:tcMar>
+              <w:top w:w="160" w:type="dxa"/>
+              <w:bottom w:w="160" w:type="dxa"/>
+              <w:left w:w="220" w:type="dxa"/>
+              <w:right w:w="220" w:type="dxa"/>
+            </w:tcMar>
+            <w:tcBorders>
+              <w:top w:val="none"/>
+              <w:left w:val="single" w:sz="30" w:space="0" w:color="6D28D9"/>
+              <w:bottom w:val="none"/>
+              <w:right w:val="none"/>
+            </w:tcBorders>
+          </w:tcPr>
+          <w:p>
+            <w:pPr>
+              <w:spacing w:before="0" w:after="80"/>
+            </w:pPr>
+            <w:r>
+              <w:rPr>
+                <w:rFonts w:ascii="Calibri" w:hAnsi="Calibri"/>
+                <w:b/>
+                <w:color w:val="6D28D9"/>
+                <w:sz w:val="22"/>
+              </w:rPr>
+              <w:t>🎯 Metodología Diferenciada: Ciencias en 1 Clic con Gemini + Historia en Pantalla con NotebookLM</w:t>
+            </w:r>
+          </w:p>
+          <w:p>
+            <w:pPr>
+              <w:spacing w:before="0" w:after="60"/>
+            </w:pPr>
+            <w:r>
+              <w:rPr>
+                <w:rFonts w:ascii="Calibri" w:hAnsi="Calibri"/>
+                <w:color w:val="28323C"/>
+                <w:sz w:val="20"/>
+              </w:rPr>
+              <w:t>1. Todas las materias de Ciencias: Sirve para Matemáticas, Física, Química, Biología, Geología y Tecnología. El abuelo escribe cualquier duda en lenguaje cotidiano (desde por qué flotan los barcos o la fórmula del etanol, hasta una integral o el ciclo del agua).</w:t>
+            </w:r>
+          </w:p>
+          <w:p>
+            <w:pPr>
+              <w:spacing w:before="0" w:after="60"/>
+            </w:pPr>
+            <w:r>
+              <w:rPr>
+                <w:rFonts w:ascii="Calibri" w:hAnsi="Calibri"/>
+                <w:color w:val="28323C"/>
+                <w:sz w:val="20"/>
+              </w:rPr>
+              <w:t>2. Calibración cognitiva por edad (Botones táctiles): Se adapta radicalmente al nieto mediante 3 botones: 👶 8-11 años (juegos, bolitas LEGO, sin tecnicismos), 🧒 12-14 años (ciencias prácticas de la ESO) y 🧑 15-18 años (rigor oficial, nomenclatura IUPAC, unidades SI y Selectividad).</w:t>
+            </w:r>
+          </w:p>
+          <w:p>
+            <w:pPr>
+              <w:spacing w:before="0" w:after="60"/>
+            </w:pPr>
+            <w:r>
+              <w:rPr>
+                <w:rFonts w:ascii="Calibri" w:hAnsi="Calibri"/>
+                <w:color w:val="28323C"/>
+                <w:sz w:val="20"/>
+              </w:rPr>
+              <w:t>3. Conexión directa con Google Gemini en 1 Clic: La app genera un prompt maestro optimizado, lo copia al portapapeles y abre Gemini sincronizadamente. Con Ctrl+V / Cmd+V y Enter, Gemini responde con ilustraciones visuales a color (prohibidos cuadros feos en texto ASCII).</w:t>
+            </w:r>
+          </w:p>
+          <w:p>
+            <w:pPr>
+              <w:spacing w:before="0" w:after="60"/>
+            </w:pPr>
+            <w:r>
+              <w:rPr>
+                <w:rFonts w:ascii="Calibri" w:hAnsi="Calibri"/>
+                <w:color w:val="28323C"/>
+                <w:sz w:val="20"/>
+              </w:rPr>
+              <w:t>4. Historia y Letras en Directo con NotebookLM: Abuelo y nieto se sientan juntos frente a la pantalla para explorar el mapa mental, concursar con tarjetas de memoria y resolver cuestionarios dinámicos con citas directas al libro escolar.</w:t>
+            </w:r>
+          </w:p>
+        </w:tc>
+      </w:tr>
+    </w:tbl>
+    <w:p>
+      <w:pPr>
+        <w:spacing w:after="80"/>
+      </w:pPr>
+    </w:p>
+    <w:p>
+      <w:pPr>
+        <w:spacing w:before="240" w:after="120"/>
+      </w:pPr>
+      <w:r>
+        <w:rPr>
+          <w:rFonts w:ascii="Calibri" w:hAnsi="Calibri"/>
+          <w:b/>
+          <w:color w:val="0B2545"/>
+          <w:sz w:val="28"/>
+        </w:rPr>
+        <w:t>1. Módulo de Ciencias, Física, Química y Matemáticas: Estructura en 5 Partes</w:t>
+      </w:r>
+    </w:p>
+    <w:p>
+      <w:pPr>
+        <w:spacing w:after="80"/>
+      </w:pPr>
+      <w:r>
+        <w:t xml:space="preserve">Cuando el nieto no entiende una fórmula o concepto científico, casi siempre es porque se lo explican de forma abstracta y fría. Al pulsar el botón </w:t>
+      </w:r>
+      <w:r>
+        <w:rPr>
+          <w:b/>
+        </w:rPr>
+        <w:t>«🚀 Preguntar a Google Gemini»</w:t>
+      </w:r>
+      <w:r>
+        <w:t>, la IA genera una ficha didáctica impecable estructurada en 5 partes clave:</w:t>
+      </w:r>
+    </w:p>
+    <w:p>
+      <w:pPr>
+        <w:spacing w:after="60"/>
+        <w:ind w:left="288"/>
+      </w:pPr>
+      <w:r>
+        <w:rPr>
+          <w:b/>
+          <w:color w:val="0066A1"/>
+        </w:rPr>
+        <w:t xml:space="preserve">🌟 1. Comprensión Intuitiva (Analogía cotidiana): </w:t>
+      </w:r>
+      <w:r>
+        <w:rPr>
+          <w:color w:val="212529"/>
+        </w:rPr>
+        <w:t>Una metáfora visual tomada de la vida diaria (la cocina, el deporte, juguetes o anécdotas históricas) para entender la idea sin miedo antes de ver fórmulas ni números.</w:t>
+      </w:r>
+    </w:p>
+    <w:p>
+      <w:pPr>
+        <w:spacing w:after="60"/>
+        <w:ind w:left="288"/>
+      </w:pPr>
+      <w:r>
+        <w:rPr>
+          <w:b/>
+          <w:color w:val="0066A1"/>
+        </w:rPr>
+        <w:t xml:space="preserve">🧠 2. El Paso a Paso Razonado (Sin saltos): </w:t>
+      </w:r>
+      <w:r>
+        <w:rPr>
+          <w:color w:val="212529"/>
+        </w:rPr>
+        <w:t>La explicación ordenada de la lógica de cada paso, eliminando los 'saltos mágicos' que desorientan al estudiante.</w:t>
+      </w:r>
+    </w:p>
+    <w:p>
+      <w:pPr>
+        <w:spacing w:after="60"/>
+        <w:ind w:left="288"/>
+      </w:pPr>
+      <w:r>
+        <w:rPr>
+          <w:b/>
+          <w:color w:val="0066A1"/>
+        </w:rPr>
+        <w:t xml:space="preserve">🎨 3. Imagen Ilustrada o Gráfica Didáctica a Color: </w:t>
+      </w:r>
+      <w:r>
+        <w:rPr>
+          <w:color w:val="212529"/>
+        </w:rPr>
+        <w:t>Gemini genera una ilustración visual limpia y a todo color con su generador de imágenes. Está estrictamente prohibido dibujar cuadros en texto plano (ASCII/guiones) en blanco y negro.</w:t>
+      </w:r>
+    </w:p>
+    <w:p>
+      <w:pPr>
+        <w:spacing w:after="60"/>
+        <w:ind w:left="288"/>
+      </w:pPr>
+      <w:r>
+        <w:rPr>
+          <w:b/>
+          <w:color w:val="0066A1"/>
+        </w:rPr>
+        <w:t xml:space="preserve">📝 4. El Nivel para su Examen (Rigor según la edad): </w:t>
+      </w:r>
+      <w:r>
+        <w:rPr>
+          <w:color w:val="212529"/>
+        </w:rPr>
+        <w:t>Las fórmulas oficiales, la notación estándar y el desarrollo analítico adaptado exactamente a su curso escolar para sacar la máxima nota.</w:t>
+      </w:r>
+    </w:p>
+    <w:p>
+      <w:pPr>
+        <w:spacing w:after="60"/>
+        <w:ind w:left="288"/>
+      </w:pPr>
+      <w:r>
+        <w:rPr>
+          <w:b/>
+          <w:color w:val="0066A1"/>
+        </w:rPr>
+        <w:t xml:space="preserve">🎯 5. El Reto Gemelo (Para el cuaderno): </w:t>
+      </w:r>
+      <w:r>
+        <w:rPr>
+          <w:color w:val="212529"/>
+        </w:rPr>
+        <w:t>Un ejercicio idéntico con datos cambiados para que el nieto lo resuelva a solas a lápiz en su cuaderno y consolide su seguridad.</w:t>
+      </w:r>
+    </w:p>
+    <w:p>
+      <w:pPr>
+        <w:spacing w:after="80"/>
+      </w:pPr>
+    </w:p>
+    <w:p>
+      <w:pPr>
+        <w:spacing w:before="240" w:after="120"/>
+      </w:pPr>
+      <w:r>
+        <w:rPr>
+          <w:rFonts w:ascii="Calibri" w:hAnsi="Calibri"/>
+          <w:b/>
+          <w:color w:val="0B2545"/>
+          <w:sz w:val="28"/>
+        </w:rPr>
+        <w:t>2. Calibración Cognitiva: Los 3 Niveles Escolares</w:t>
+      </w:r>
+    </w:p>
+    <w:p>
+      <w:pPr>
+        <w:spacing w:after="80"/>
+      </w:pPr>
+      <w:r>
+        <w:t xml:space="preserve">Una misma pregunta (por ejemplo: </w:t>
+      </w:r>
+      <w:r>
+        <w:rPr>
+          <w:b/>
+        </w:rPr>
+        <w:t>«¿Cuál es la fórmula del etanol?»</w:t>
+      </w:r>
+      <w:r>
+        <w:t>) exige explicaciones totalmente distintas según la edad del nieto:</w:t>
+      </w:r>
+    </w:p>
+    <w:p>
+      <w:pPr>
+        <w:spacing w:after="60"/>
+        <w:ind w:left="288"/>
+      </w:pPr>
+      <w:r>
+        <w:rPr>
+          <w:b/>
+          <w:color w:val="6D28D9"/>
+        </w:rPr>
+        <w:t xml:space="preserve">👶 8 a 11 años (Primaria): </w:t>
+      </w:r>
+      <w:r>
+        <w:rPr>
+          <w:color w:val="212529"/>
+        </w:rPr>
+        <w:t>Prohibidas fórmulas químicas complejas y enlaces covalentes. Se explica como una 'receta mágica de bolitas LEGO' (2 de carbono, 6 de hidrógeno y 1 de oxígeno dándose la mano) y su utilidad en el botiquín de casa para curar heridas.</w:t>
+      </w:r>
+    </w:p>
+    <w:p>
+      <w:pPr>
+        <w:spacing w:after="60"/>
+        <w:ind w:left="288"/>
+      </w:pPr>
+      <w:r>
+        <w:rPr>
+          <w:b/>
+          <w:color w:val="6D28D9"/>
+        </w:rPr>
+        <w:t xml:space="preserve">🧒 12 a 14 años (1º y 2º ESO): </w:t>
+      </w:r>
+      <w:r>
+        <w:rPr>
+          <w:color w:val="212529"/>
+        </w:rPr>
+        <w:t>Notación elemental de secundaria (C₂H₆O / CH₃-CH₂-OH), átomos y enlaces sencillos, explicando la fermentación de la fruta y los desinfectantes cotidianos.</w:t>
+      </w:r>
+    </w:p>
+    <w:p>
+      <w:pPr>
+        <w:spacing w:after="60"/>
+        <w:ind w:left="288"/>
+      </w:pPr>
+      <w:r>
+        <w:rPr>
+          <w:b/>
+          <w:color w:val="6D28D9"/>
+        </w:rPr>
+        <w:t xml:space="preserve">🧑 15 a 18 años (3º ESO y Bachillerato): </w:t>
+      </w:r>
+      <w:r>
+        <w:rPr>
+          <w:color w:val="212529"/>
+        </w:rPr>
+        <w:t>Máximo rigor pre-universitario: grupo funcional alcohol (-OH), fórmula semidesarrollada, polaridad, nomenclatura IUPAC oficial y unidades del Sistema Internacional (SI) para examen y Selectividad/EBAU.</w:t>
+      </w:r>
+    </w:p>
+    <w:p>
+      <w:pPr>
+        <w:spacing w:after="80"/>
+      </w:pPr>
+    </w:p>
+    <w:p>
+      <w:pPr>
+        <w:spacing w:before="240" w:after="120"/>
+      </w:pPr>
+      <w:r>
+        <w:rPr>
+          <w:rFonts w:ascii="Calibri" w:hAnsi="Calibri"/>
+          <w:b/>
+          <w:color w:val="0B2545"/>
+          <w:sz w:val="28"/>
+        </w:rPr>
+        <w:t>3. Módulo de Historia y Ciencias: La Sesión en Vivo con NotebookLM</w:t>
       </w:r>
     </w:p>
     <w:tbl>
@@ -86,239 +426,7 @@
                 <w:color w:val="0066A1"/>
                 <w:sz w:val="22"/>
               </w:rPr>
-              <w:t>🎯 El Enfoque Pedagógico: Matemáticas en la App + Historia en Directo en Pantalla</w:t>
-            </w:r>
-          </w:p>
-          <w:p>
-            <w:pPr>
-              <w:spacing w:before="0" w:after="60"/>
-            </w:pPr>
-            <w:r>
-              <w:rPr>
-                <w:rFonts w:ascii="Calibri" w:hAnsi="Calibri"/>
-                <w:color w:val="28323C"/>
-                <w:sz w:val="20"/>
-              </w:rPr>
-              <w:t>En Matemáticas: Usamos la aplicación «Educanietos IA». El abuelo introduce cualquier problema en lenguaje libre y la IA lo desglosa en 4 capas pedagógicas (analogía intuitiva, paso a paso lógico, rigor de examen y reto gemelo imprimible con cuadrícula).</w:t>
-            </w:r>
-          </w:p>
-          <w:p>
-            <w:pPr>
-              <w:spacing w:before="0" w:after="60"/>
-            </w:pPr>
-            <w:r>
-              <w:rPr>
-                <w:rFonts w:ascii="Calibri" w:hAnsi="Calibri"/>
-                <w:color w:val="28323C"/>
-                <w:sz w:val="20"/>
-              </w:rPr>
-              <w:t>En Historia y Ciencias: Trabajamos directamente en pantalla dentro de Google NotebookLM. Al ser el mapa mental interactivo, las tarjetas y los cuestionarios multipantalla herramientas vivas, abuelo y nieto se sientan juntos frente a la pantalla para explorar, jugar y contrastar citas sin necesidad de imprimir ni hacer capturas engorrosas.</w:t>
-            </w:r>
-          </w:p>
-          <w:p>
-            <w:pPr>
-              <w:spacing w:before="0" w:after="60"/>
-            </w:pPr>
-            <w:r>
-              <w:rPr>
-                <w:rFonts w:ascii="Calibri" w:hAnsi="Calibri"/>
-                <w:color w:val="28323C"/>
-                <w:sz w:val="20"/>
-              </w:rPr>
-              <w:t>El valor insustituible del abuelo tutor: Tranquilidad, paciencia sin reproches y el afecto necesario para devolverle al nieto la seguridad en sí mismo.</w:t>
-            </w:r>
-          </w:p>
-        </w:tc>
-      </w:tr>
-    </w:tbl>
-    <w:p>
-      <w:pPr>
-        <w:spacing w:after="80"/>
-      </w:pPr>
-    </w:p>
-    <w:p>
-      <w:pPr>
-        <w:spacing w:before="240" w:after="120"/>
-      </w:pPr>
-      <w:r>
-        <w:rPr>
-          <w:rFonts w:ascii="Calibri" w:hAnsi="Calibri"/>
-          <w:b/>
-          <w:color w:val="0B2545"/>
-          <w:sz w:val="28"/>
-        </w:rPr>
-        <w:t>1. Módulo de Matemáticas: La Técnica de las 4 Capas Pedagógicas</w:t>
-      </w:r>
-    </w:p>
-    <w:p>
-      <w:pPr>
-        <w:spacing w:after="80"/>
-      </w:pPr>
-      <w:r>
-        <w:t xml:space="preserve">Cuando un niño se atasca en matemáticas, casi siempre es porque le han enseñado la fórmula antes de que entienda la idea. En la aplicación </w:t>
-      </w:r>
-      <w:r>
-        <w:rPr>
-          <w:b/>
-        </w:rPr>
-        <w:t>«Educanietos IA»</w:t>
-      </w:r>
-      <w:r>
-        <w:t>, cualquier problema o duda planteada en lenguaje cotidiano se resuelve en 4 niveles:</w:t>
-      </w:r>
-    </w:p>
-    <w:p>
-      <w:pPr>
-        <w:spacing w:after="60"/>
-        <w:ind w:left="288"/>
-      </w:pPr>
-      <w:r>
-        <w:rPr>
-          <w:b/>
-          <w:color w:val="0066A1"/>
-        </w:rPr>
-        <w:t xml:space="preserve">🌟 Nivel 1: Para comprenderlo sin miedo (La analogía cotidiana): </w:t>
-      </w:r>
-      <w:r>
-        <w:rPr>
-          <w:color w:val="212529"/>
-        </w:rPr>
-        <w:t>Una metáfora sencilla sin números que conecta con la vida real (balanzas de cocina, cintas métricas, repartos de merienda o cajas sorpresa).</w:t>
-      </w:r>
-    </w:p>
-    <w:p>
-      <w:pPr>
-        <w:spacing w:after="60"/>
-        <w:ind w:left="288"/>
-      </w:pPr>
-      <w:r>
-        <w:rPr>
-          <w:b/>
-          <w:color w:val="0066A1"/>
-        </w:rPr>
-        <w:t xml:space="preserve">🧠 Nivel 2: El paso a paso razonado (El puente lógico): </w:t>
-      </w:r>
-      <w:r>
-        <w:rPr>
-          <w:color w:val="212529"/>
-        </w:rPr>
-        <w:t>La explicación detallada de cada movimiento sin dar nada por sentado, eliminando los 'saltos mágicos' que confunden al estudiante.</w:t>
-      </w:r>
-    </w:p>
-    <w:p>
-      <w:pPr>
-        <w:spacing w:after="60"/>
-        <w:ind w:left="288"/>
-      </w:pPr>
-      <w:r>
-        <w:rPr>
-          <w:b/>
-          <w:color w:val="0066A1"/>
-        </w:rPr>
-        <w:t xml:space="preserve">📝 Nivel 3: Para el examen del colegio (Rigor formal): </w:t>
-      </w:r>
-      <w:r>
-        <w:rPr>
-          <w:color w:val="212529"/>
-        </w:rPr>
-        <w:t>El desarrollo algebraico estricto con las fórmulas del currículo escolar para que el profesor le ponga la máxima calificación.</w:t>
-      </w:r>
-    </w:p>
-    <w:p>
-      <w:pPr>
-        <w:spacing w:after="60"/>
-        <w:ind w:left="288"/>
-      </w:pPr>
-      <w:r>
-        <w:rPr>
-          <w:b/>
-          <w:color w:val="0066A1"/>
-        </w:rPr>
-        <w:t xml:space="preserve">🎯 Nivel 4: El Reto Gemelo (Problema espejo imprimible): </w:t>
-      </w:r>
-      <w:r>
-        <w:rPr>
-          <w:color w:val="212529"/>
-        </w:rPr>
-        <w:t>Un ejercicio idéntico con números cambiados. La aplicación permite imprimir una ficha en PDF con una cuadrícula milimetrada para que el nieto lo resuelva a lápiz y demuestre su dominio.</w:t>
-      </w:r>
-    </w:p>
-    <w:p>
-      <w:pPr>
-        <w:spacing w:after="80"/>
-      </w:pPr>
-    </w:p>
-    <w:p>
-      <w:pPr>
-        <w:spacing w:before="240" w:after="120"/>
-      </w:pPr>
-      <w:r>
-        <w:rPr>
-          <w:rFonts w:ascii="Calibri" w:hAnsi="Calibri"/>
-          <w:b/>
-          <w:color w:val="0B2545"/>
-          <w:sz w:val="28"/>
-        </w:rPr>
-        <w:t>2. Historia y Ciencias: La Sesión en Directo sobre Pantalla con NotebookLM</w:t>
-      </w:r>
-    </w:p>
-    <w:p>
-      <w:pPr>
-        <w:spacing w:after="80"/>
-      </w:pPr>
-      <w:r>
-        <w:rPr>
-          <w:color w:val="212529"/>
-        </w:rPr>
-        <w:t xml:space="preserve">Las funciones de estudio de NotebookLM (el Mapa Mental interactivo, las Tarjetas de memoria y los Cuestionarios dinámicos) no están pensadas para imprimirse en un papel estático ni guardarse en capturas. </w:t>
-      </w:r>
-      <w:r>
-        <w:rPr>
-          <w:b/>
-        </w:rPr>
-        <w:t>Están diseñadas para vivirse en directo en la pantalla entre el abuelo y el nieto:</w:t>
-      </w:r>
-    </w:p>
-    <w:tbl>
-      <w:tblPr>
-        <w:tblW w:type="auto" w:w="0"/>
-        <w:jc w:val="center"/>
-        <w:tblLayout w:type="fixed"/>
-        <w:tblLook w:firstColumn="1" w:firstRow="1" w:lastColumn="0" w:lastRow="0" w:noHBand="0" w:noVBand="1" w:val="04A0"/>
-      </w:tblPr>
-      <w:tblGrid>
-        <w:gridCol w:w="9360"/>
-      </w:tblGrid>
-      <w:tr>
-        <w:tc>
-          <w:tcPr>
-            <w:tcW w:type="dxa" w:w="9792"/>
-            <w:shd w:fill="E6FCF5"/>
-            <w:tcMar>
-              <w:top w:w="160" w:type="dxa"/>
-              <w:bottom w:w="160" w:type="dxa"/>
-              <w:left w:w="220" w:type="dxa"/>
-              <w:right w:w="220" w:type="dxa"/>
-            </w:tcMar>
-            <w:tcBorders>
-              <w:top w:val="none"/>
-              <w:left w:val="single" w:sz="30" w:space="0" w:color="0B7285"/>
-              <w:bottom w:val="none"/>
-              <w:right w:val="none"/>
-            </w:tcBorders>
-          </w:tcPr>
-          <w:p>
-            <w:pPr>
-              <w:spacing w:before="0" w:after="80"/>
-            </w:pPr>
-            <w:r>
-              <w:rPr>
-                <w:rFonts w:ascii="Calibri" w:hAnsi="Calibri"/>
-                <w:b/>
-                <w:color w:val="0B7285"/>
-                <w:sz w:val="22"/>
-              </w:rPr>
-              <w:t>💻 LA DINÁMICA ABUELO-NIETO FRENTE A NOTEBOOKLM</w:t>
+              <w:t>💻 Dinámica de Estudio Abuelo-Nieto en Pantalla</w:t>
             </w:r>
           </w:p>
           <w:p>
@@ -344,7 +452,7 @@
                 <w:color w:val="28323C"/>
                 <w:sz w:val="20"/>
               </w:rPr>
-              <w:t>2. El Mapa Mental en pantalla: En Studio, pulsáis «Mapa mental». Vais desplegando juntos los nodos en pantalla para entender las causas y consecuencias visualmente.</w:t>
+              <w:t>2. Mapa Mental interactivo: En Studio, pulsáis «Mapa mental». Desplegáis juntos los nodos en pantalla para entender las causas y consecuencias visualmente.</w:t>
             </w:r>
           </w:p>
           <w:p>
@@ -357,7 +465,7 @@
                 <w:color w:val="28323C"/>
                 <w:sz w:val="20"/>
               </w:rPr>
-              <w:t>3. El Concurso de Tarjetas: Pulsáis «Tarjetas». El abuelo lee la pregunta en voz alta, el nieto piensa la respuesta y hacen clic en la tarjeta para comprobar si acierta.</w:t>
+              <w:t>3. Concurso de Tarjetas (Flashcards): Pulsáis «Tarjetas». El abuelo lee la pregunta en voz alta, el nieto piensa la respuesta y hacen clic en la tarjeta para comprobar si acierta.</w:t>
             </w:r>
           </w:p>
           <w:p>
@@ -370,7 +478,7 @@
                 <w:color w:val="28323C"/>
                 <w:sz w:val="20"/>
               </w:rPr>
-              <w:t>4. Cuestionario interactivo con Citas: Contestáis juntos el test pantalla a pantalla. Si el nieto duda, pulsa el número de cita y NLM resalta el renglón exacto del libro donde está la respuesta.</w:t>
+              <w:t>4. Cuestionario con Citas directas: Contestáis juntos el test pantalla a pantalla. Si el nieto duda, pulsa el número de cita y NLM resalta el renglón exacto del libro donde está la prueba documental.</w:t>
             </w:r>
           </w:p>
         </w:tc>
@@ -380,89 +488,6 @@
       <w:pPr>
         <w:spacing w:after="80"/>
       </w:pPr>
-    </w:p>
-    <w:p>
-      <w:pPr>
-        <w:spacing w:before="240" w:after="120"/>
-      </w:pPr>
-      <w:r>
-        <w:rPr>
-          <w:rFonts w:ascii="Calibri" w:hAnsi="Calibri"/>
-          <w:b/>
-          <w:color w:val="0B2545"/>
-          <w:sz w:val="28"/>
-        </w:rPr>
-        <w:t>3. Guía Paso a Paso para la Sesión Práctica</w:t>
-      </w:r>
-    </w:p>
-    <w:p>
-      <w:pPr>
-        <w:spacing w:after="60"/>
-        <w:ind w:left="288"/>
-      </w:pPr>
-      <w:r>
-        <w:rPr>
-          <w:b/>
-        </w:rPr>
-        <w:t xml:space="preserve">[  ] Paso 1: Abrir Educanietos IA en el Navegador: </w:t>
-      </w:r>
-      <w:r>
-        <w:rPr>
-          <w:color w:val="212529"/>
-        </w:rPr>
-        <w:t xml:space="preserve">Abre </w:t>
-      </w:r>
-      <w:r>
-        <w:rPr>
-          <w:b/>
-        </w:rPr>
-        <w:t>index.html</w:t>
-      </w:r>
-      <w:r>
-        <w:t xml:space="preserve"> en Google Chrome o Edge. En el Módulo 1 escribe la duda matemática que tenga tu nieto.</w:t>
-      </w:r>
-    </w:p>
-    <w:p>
-      <w:pPr>
-        <w:spacing w:after="60"/>
-        <w:ind w:left="288"/>
-      </w:pPr>
-      <w:r>
-        <w:rPr>
-          <w:b/>
-        </w:rPr>
-        <w:t xml:space="preserve">[  ] Paso 2: Explicarle la metáfora y darle la ficha: </w:t>
-      </w:r>
-      <w:r>
-        <w:t>Léele la analogía cotidiana mientras merendáis. Pulsa «Imprimir Ficha con Cuadrícula» y dale la hoja para que intente el Reto Gemelo a solas con lápiz.</w:t>
-      </w:r>
-    </w:p>
-    <w:p>
-      <w:pPr>
-        <w:spacing w:after="60"/>
-        <w:ind w:left="288"/>
-      </w:pPr>
-      <w:r>
-        <w:rPr>
-          <w:b/>
-        </w:rPr>
-        <w:t xml:space="preserve">[  ] Paso 3: Sesión de Historia/Ciencias en NotebookLM: </w:t>
-      </w:r>
-      <w:r>
-        <w:rPr>
-          <w:color w:val="212529"/>
-        </w:rPr>
-        <w:t xml:space="preserve">Abre </w:t>
-      </w:r>
-      <w:r>
-        <w:rPr>
-          <w:b/>
-        </w:rPr>
-        <w:t>notebooklm.google.com</w:t>
-      </w:r>
-      <w:r>
-        <w:t>. Sube las fotos de los apuntes y jugad juntos a las Tarjetas y al Cuestionario interactivo en la pantalla.</w:t>
-      </w:r>
     </w:p>
     <w:p>
       <w:pPr>
@@ -493,7 +518,7 @@
       <w:tr>
         <w:tc>
           <w:tcPr>
-            <w:tcW w:type="dxa" w:w="1440"/>
+            <w:tcW w:type="dxa" w:w="1728"/>
             <w:shd w:fill="0B2545"/>
             <w:tcMar>
               <w:top w:w="100" w:type="dxa"/>
@@ -510,7 +535,7 @@
                 <w:color w:val="FFFFFF"/>
                 <w:sz w:val="19"/>
               </w:rPr>
-              <w:t>Módulo</w:t>
+              <w:t>Materia / Módulo</w:t>
             </w:r>
           </w:p>
         </w:tc>
@@ -539,7 +564,7 @@
         </w:tc>
         <w:tc>
           <w:tcPr>
-            <w:tcW w:type="dxa" w:w="2448"/>
+            <w:tcW w:type="dxa" w:w="2160"/>
             <w:shd w:fill="0B2545"/>
             <w:tcMar>
               <w:top w:w="100" w:type="dxa"/>
@@ -564,7 +589,7 @@
       <w:tr>
         <w:tc>
           <w:tcPr>
-            <w:tcW w:type="dxa" w:w="1440"/>
+            <w:tcW w:type="dxa" w:w="1728"/>
             <w:shd w:fill="FFFFFF"/>
             <w:tcMar>
               <w:top w:w="70" w:type="dxa"/>
@@ -584,7 +609,7 @@
                 <w:color w:val="212529"/>
                 <w:sz w:val="18"/>
               </w:rPr>
-              <w:t>Matemáticas</w:t>
+              <w:t>Ciencias / Mates</w:t>
             </w:r>
           </w:p>
         </w:tc>
@@ -609,13 +634,13 @@
                 <w:color w:val="212529"/>
                 <w:sz w:val="18"/>
               </w:rPr>
-              <w:t>Sé escribir cualquier problema libremente en Educanietos IA y obtener la analogía intuitiva.</w:t>
+              <w:t>Sé escribir dudas de Matemáticas, Física o Química y seleccionar el botón de edad de mi nieto.</w:t>
             </w:r>
           </w:p>
         </w:tc>
         <w:tc>
           <w:tcPr>
-            <w:tcW w:type="dxa" w:w="2448"/>
+            <w:tcW w:type="dxa" w:w="2160"/>
             <w:shd w:fill="FFFFFF"/>
             <w:tcMar>
               <w:top w:w="70" w:type="dxa"/>
@@ -642,7 +667,7 @@
       <w:tr>
         <w:tc>
           <w:tcPr>
-            <w:tcW w:type="dxa" w:w="1440"/>
+            <w:tcW w:type="dxa" w:w="1728"/>
             <w:shd w:fill="F8FAFC"/>
             <w:tcMar>
               <w:top w:w="70" w:type="dxa"/>
@@ -662,7 +687,7 @@
                 <w:color w:val="212529"/>
                 <w:sz w:val="18"/>
               </w:rPr>
-              <w:t>Matemáticas</w:t>
+              <w:t>Ciencias / Mates</w:t>
             </w:r>
           </w:p>
         </w:tc>
@@ -687,13 +712,13 @@
                 <w:color w:val="212529"/>
                 <w:sz w:val="18"/>
               </w:rPr>
-              <w:t>Sé imprimir la ficha con cuadrícula para que mi nieto resuelva el Reto Gemelo a lápiz.</w:t>
+              <w:t>Sé pulsar 'Preguntar a Gemini', pegar en la ventana abierta y revisar la ilustración a color generada.</w:t>
             </w:r>
           </w:p>
         </w:tc>
         <w:tc>
           <w:tcPr>
-            <w:tcW w:type="dxa" w:w="2448"/>
+            <w:tcW w:type="dxa" w:w="2160"/>
             <w:shd w:fill="F8FAFC"/>
             <w:tcMar>
               <w:top w:w="70" w:type="dxa"/>
@@ -720,7 +745,7 @@
       <w:tr>
         <w:tc>
           <w:tcPr>
-            <w:tcW w:type="dxa" w:w="1440"/>
+            <w:tcW w:type="dxa" w:w="1728"/>
             <w:shd w:fill="FFFFFF"/>
             <w:tcMar>
               <w:top w:w="70" w:type="dxa"/>
@@ -740,7 +765,7 @@
                 <w:color w:val="212529"/>
                 <w:sz w:val="18"/>
               </w:rPr>
-              <w:t>Historia/CC</w:t>
+              <w:t>Ciencias / Mates</w:t>
             </w:r>
           </w:p>
         </w:tc>
@@ -765,13 +790,13 @@
                 <w:color w:val="212529"/>
                 <w:sz w:val="18"/>
               </w:rPr>
-              <w:t>Sé subir fotos de los apuntes o libros del nieto a Google NotebookLM como fuentes.</w:t>
+              <w:t>Sé proponerle el Reto Gemelo para que mi nieto lo resuelva a solas a lápiz en su cuaderno.</w:t>
             </w:r>
           </w:p>
         </w:tc>
         <w:tc>
           <w:tcPr>
-            <w:tcW w:type="dxa" w:w="2448"/>
+            <w:tcW w:type="dxa" w:w="2160"/>
             <w:shd w:fill="FFFFFF"/>
             <w:tcMar>
               <w:top w:w="70" w:type="dxa"/>
@@ -798,7 +823,7 @@
       <w:tr>
         <w:tc>
           <w:tcPr>
-            <w:tcW w:type="dxa" w:w="1440"/>
+            <w:tcW w:type="dxa" w:w="1728"/>
             <w:shd w:fill="F8FAFC"/>
             <w:tcMar>
               <w:top w:w="70" w:type="dxa"/>
@@ -818,7 +843,7 @@
                 <w:color w:val="212529"/>
                 <w:sz w:val="18"/>
               </w:rPr>
-              <w:t>Historia/CC</w:t>
+              <w:t>Historia / Letras</w:t>
             </w:r>
           </w:p>
         </w:tc>
@@ -843,13 +868,13 @@
                 <w:color w:val="212529"/>
                 <w:sz w:val="18"/>
               </w:rPr>
-              <w:t>Sé explorar el Mapa Mental y jugar a las Tarjetas interactivas en pantalla junto a mi nieto.</w:t>
+              <w:t>Sé subir fotos de los apuntes o libros del nieto a Google NotebookLM como fuentes fiables.</w:t>
             </w:r>
           </w:p>
         </w:tc>
         <w:tc>
           <w:tcPr>
-            <w:tcW w:type="dxa" w:w="2448"/>
+            <w:tcW w:type="dxa" w:w="2160"/>
             <w:shd w:fill="F8FAFC"/>
             <w:tcMar>
               <w:top w:w="70" w:type="dxa"/>
@@ -876,7 +901,7 @@
       <w:tr>
         <w:tc>
           <w:tcPr>
-            <w:tcW w:type="dxa" w:w="1440"/>
+            <w:tcW w:type="dxa" w:w="1728"/>
             <w:shd w:fill="FFFFFF"/>
             <w:tcMar>
               <w:top w:w="70" w:type="dxa"/>
@@ -896,7 +921,7 @@
                 <w:color w:val="212529"/>
                 <w:sz w:val="18"/>
               </w:rPr>
-              <w:t>Historia/CC</w:t>
+              <w:t>Historia / Letras</w:t>
             </w:r>
           </w:p>
         </w:tc>
@@ -921,13 +946,13 @@
                 <w:color w:val="212529"/>
                 <w:sz w:val="18"/>
               </w:rPr>
-              <w:t>Sé resolver el Cuestionario dinámico de NLM usando las citas directas para investigar.</w:t>
+              <w:t>Sé explorar el Mapa Mental y jugar al concurso de Tarjetas y Cuestionarios interactivos en pantalla.</w:t>
             </w:r>
           </w:p>
         </w:tc>
         <w:tc>
           <w:tcPr>
-            <w:tcW w:type="dxa" w:w="2448"/>
+            <w:tcW w:type="dxa" w:w="2160"/>
             <w:shd w:fill="FFFFFF"/>
             <w:tcMar>
               <w:top w:w="70" w:type="dxa"/>

</xml_diff>